<commit_message>
nmv 01 05 2026
</commit_message>
<xml_diff>
--- a/TS Jatai Ghanam Project/TS 1.4/TS 1.4 Ghanam Malayalam Corrections.docx
+++ b/TS Jatai Ghanam Project/TS 1.4/TS 1.4 Ghanam Malayalam Corrections.docx
@@ -22,18 +22,7 @@
           <w:szCs w:val="32"/>
           <w:u w:val="single"/>
         </w:rPr>
-        <w:t xml:space="preserve">TS Ghanam – TS 1.4 Malayalam Corrections – Observed </w:t>
-      </w:r>
-      <w:proofErr w:type="gramStart"/>
-      <w:r>
-        <w:rPr>
-          <w:b/>
-          <w:bCs/>
-          <w:sz w:val="32"/>
-          <w:szCs w:val="32"/>
-          <w:u w:val="single"/>
-        </w:rPr>
-        <w:t xml:space="preserve">till </w:t>
+        <w:t xml:space="preserve">TS Ghanam – TS 1.4 Malayalam Corrections – Observed till </w:t>
       </w:r>
       <w:r>
         <w:rPr>
@@ -46,7 +35,6 @@
         </w:rPr>
         <w:t>?????</w:t>
       </w:r>
-      <w:proofErr w:type="gramEnd"/>
     </w:p>
     <w:p>
       <w:pPr>
@@ -71,7 +59,7 @@
     </w:p>
     <w:tbl>
       <w:tblPr>
-        <w:tblW w:w="14962" w:type="dxa"/>
+        <w:tblW w:w="13970" w:type="dxa"/>
         <w:tblInd w:w="-792" w:type="dxa"/>
         <w:tblBorders>
           <w:top w:val="single" w:sz="4" w:space="0" w:color="000000"/>
@@ -85,7 +73,7 @@
       </w:tblPr>
       <w:tblGrid>
         <w:gridCol w:w="7450"/>
-        <w:gridCol w:w="7512"/>
+        <w:gridCol w:w="6520"/>
       </w:tblGrid>
       <w:tr>
         <w:tc>
@@ -114,7 +102,7 @@
         </w:tc>
         <w:tc>
           <w:tcPr>
-            <w:tcW w:w="7512" w:type="dxa"/>
+            <w:tcW w:w="6520" w:type="dxa"/>
           </w:tcPr>
           <w:p>
             <w:pPr>
@@ -461,19 +449,8 @@
                 <w:sz w:val="32"/>
                 <w:szCs w:val="40"/>
               </w:rPr>
-              <w:t>k¢</w:t>
-            </w:r>
-            <w:proofErr w:type="gramStart"/>
-            <w:r>
-              <w:rPr>
-                <w:rFonts w:ascii="BRH Malayalam Extra" w:hAnsi="BRH Malayalam Extra" w:cs="BRH Malayalam Extra"/>
-                <w:color w:val="000000"/>
-                <w:sz w:val="32"/>
-                <w:szCs w:val="40"/>
-              </w:rPr>
-              <w:t>˜(</w:t>
-            </w:r>
-            <w:proofErr w:type="gramEnd"/>
+              <w:t>k¢˜(</w:t>
+            </w:r>
             <w:r>
               <w:rPr>
                 <w:rFonts w:cs="BRH Malayalam Extra"/>
@@ -549,7 +526,7 @@
         </w:tc>
         <w:tc>
           <w:tcPr>
-            <w:tcW w:w="7512" w:type="dxa"/>
+            <w:tcW w:w="6520" w:type="dxa"/>
           </w:tcPr>
           <w:p>
             <w:pPr>
@@ -869,72 +846,33 @@
                 <w:sz w:val="32"/>
                 <w:szCs w:val="40"/>
               </w:rPr>
-              <w:t>k¢</w:t>
-            </w:r>
-            <w:proofErr w:type="gramStart"/>
-            <w:r>
-              <w:rPr>
-                <w:rFonts w:ascii="BRH Malayalam Extra" w:hAnsi="BRH Malayalam Extra" w:cs="BRH Malayalam Extra"/>
+              <w:t>k¢˜(</w:t>
+            </w:r>
+            <w:r>
+              <w:rPr>
+                <w:rFonts w:cs="BRH Malayalam Extra"/>
                 <w:color w:val="000000"/>
-                <w:sz w:val="32"/>
-                <w:szCs w:val="40"/>
-              </w:rPr>
-              <w:t>˜(</w:t>
-            </w:r>
-            <w:proofErr w:type="gramEnd"/>
-            <w:r>
-              <w:rPr>
-                <w:rFonts w:cs="BRH Malayalam Extra"/>
+                <w:szCs w:val="40"/>
+              </w:rPr>
+              <w:t>1</w:t>
+            </w:r>
+            <w:r>
+              <w:rPr>
+                <w:rFonts w:ascii="BRH Malayalam Extra" w:hAnsi="BRH Malayalam Extra" w:cs="BRH Malayalam Extra"/>
                 <w:color w:val="000000"/>
-                <w:szCs w:val="40"/>
-              </w:rPr>
-              <w:t>1</w:t>
+                <w:sz w:val="26"/>
+                <w:szCs w:val="40"/>
+              </w:rPr>
+              <w:t>–</w:t>
             </w:r>
             <w:r>
               <w:rPr>
                 <w:rFonts w:ascii="BRH Malayalam Extra" w:hAnsi="BRH Malayalam Extra" w:cs="BRH Malayalam Extra"/>
                 <w:color w:val="000000"/>
-                <w:sz w:val="26"/>
-                <w:szCs w:val="40"/>
-              </w:rPr>
-              <w:t>–</w:t>
-            </w:r>
-            <w:r>
-              <w:rPr>
-                <w:rFonts w:ascii="BRH Malayalam Extra" w:hAnsi="BRH Malayalam Extra" w:cs="BRH Malayalam Extra"/>
-                <w:color w:val="000000"/>
-                <w:sz w:val="32"/>
-                <w:szCs w:val="40"/>
-              </w:rPr>
-              <w:t xml:space="preserve">) ªp—ræ¡ Zûx Zûx </w:t>
-            </w:r>
-            <w:r>
-              <w:rPr>
-                <w:rFonts w:ascii="BRH Malayalam Extra" w:hAnsi="BRH Malayalam Extra" w:cs="BRH Malayalam Extra"/>
-                <w:color w:val="000000"/>
-                <w:sz w:val="32"/>
-                <w:szCs w:val="40"/>
-                <w:highlight w:val="green"/>
-              </w:rPr>
-              <w:t>„ræ¢</w:t>
-            </w:r>
-            <w:r>
-              <w:rPr>
-                <w:rFonts w:ascii="BRH Malayalam Extra" w:hAnsi="BRH Malayalam Extra" w:cs="BRH Malayalam Extra"/>
-                <w:color w:val="000000"/>
-                <w:sz w:val="26"/>
-                <w:szCs w:val="40"/>
-              </w:rPr>
-              <w:t>–</w:t>
-            </w:r>
-            <w:r>
-              <w:rPr>
-                <w:rFonts w:ascii="BRH Malayalam Extra" w:hAnsi="BRH Malayalam Extra" w:cs="BRH Malayalam Extra"/>
-                <w:color w:val="000000"/>
-                <w:sz w:val="32"/>
-                <w:szCs w:val="40"/>
-              </w:rPr>
-              <w:t xml:space="preserve">k¡ | </w:t>
+                <w:sz w:val="32"/>
+                <w:szCs w:val="40"/>
+              </w:rPr>
+              <w:t xml:space="preserve">) ªp—ræ¡ Zûx </w:t>
             </w:r>
           </w:p>
           <w:p>
@@ -943,7 +881,7 @@
               <w:autoSpaceDE w:val="0"/>
               <w:autoSpaceDN w:val="0"/>
               <w:adjustRightInd w:val="0"/>
-              <w:spacing w:before="0" w:line="240" w:lineRule="auto"/>
+              <w:spacing w:line="240" w:lineRule="auto"/>
               <w:rPr>
                 <w:rFonts w:cs="Latha"/>
                 <w:b/>
@@ -953,6 +891,543 @@
                 <w:lang w:bidi="ta-IN"/>
               </w:rPr>
             </w:pPr>
+            <w:r>
+              <w:rPr>
+                <w:rFonts w:ascii="BRH Malayalam Extra" w:hAnsi="BRH Malayalam Extra" w:cs="BRH Malayalam Extra"/>
+                <w:color w:val="000000"/>
+                <w:sz w:val="32"/>
+                <w:szCs w:val="40"/>
+              </w:rPr>
+              <w:t xml:space="preserve">Zûx </w:t>
+            </w:r>
+            <w:r>
+              <w:rPr>
+                <w:rFonts w:ascii="BRH Malayalam Extra" w:hAnsi="BRH Malayalam Extra" w:cs="BRH Malayalam Extra"/>
+                <w:color w:val="000000"/>
+                <w:sz w:val="32"/>
+                <w:szCs w:val="40"/>
+                <w:highlight w:val="green"/>
+              </w:rPr>
+              <w:t>„ræ¢</w:t>
+            </w:r>
+            <w:r>
+              <w:rPr>
+                <w:rFonts w:ascii="BRH Malayalam Extra" w:hAnsi="BRH Malayalam Extra" w:cs="BRH Malayalam Extra"/>
+                <w:color w:val="000000"/>
+                <w:sz w:val="26"/>
+                <w:szCs w:val="40"/>
+              </w:rPr>
+              <w:t>–</w:t>
+            </w:r>
+            <w:r>
+              <w:rPr>
+                <w:rFonts w:ascii="BRH Malayalam Extra" w:hAnsi="BRH Malayalam Extra" w:cs="BRH Malayalam Extra"/>
+                <w:color w:val="000000"/>
+                <w:sz w:val="32"/>
+                <w:szCs w:val="40"/>
+              </w:rPr>
+              <w:t xml:space="preserve">k¡ | </w:t>
+            </w:r>
+          </w:p>
+        </w:tc>
+      </w:tr>
+      <w:tr>
+        <w:trPr>
+          <w:trHeight w:val="1433"/>
+        </w:trPr>
+        <w:tc>
+          <w:tcPr>
+            <w:tcW w:w="7450" w:type="dxa"/>
+          </w:tcPr>
+          <w:p>
+            <w:pPr>
+              <w:widowControl w:val="0"/>
+              <w:autoSpaceDE w:val="0"/>
+              <w:autoSpaceDN w:val="0"/>
+              <w:adjustRightInd w:val="0"/>
+              <w:spacing w:line="240" w:lineRule="auto"/>
+              <w:rPr>
+                <w:rFonts w:ascii="BRH Malayalam Extra" w:hAnsi="BRH Malayalam Extra" w:cs="BRH Malayalam Extra"/>
+                <w:color w:val="000000"/>
+                <w:sz w:val="32"/>
+                <w:szCs w:val="40"/>
+              </w:rPr>
+            </w:pPr>
+            <w:r>
+              <w:rPr>
+                <w:rFonts w:cs="BRH Malayalam Extra"/>
+                <w:color w:val="000000"/>
+                <w:szCs w:val="40"/>
+              </w:rPr>
+              <w:t>23</w:t>
+            </w:r>
+            <w:r>
+              <w:rPr>
+                <w:rFonts w:ascii="BRH Malayalam Extra" w:hAnsi="BRH Malayalam Extra" w:cs="BRH Malayalam Extra"/>
+                <w:color w:val="000000"/>
+                <w:sz w:val="32"/>
+                <w:szCs w:val="40"/>
+              </w:rPr>
+              <w:t>)</w:t>
+            </w:r>
+            <w:r>
+              <w:rPr>
+                <w:rFonts w:ascii="BRH Malayalam Extra" w:hAnsi="BRH Malayalam Extra" w:cs="BRH Malayalam Extra"/>
+                <w:color w:val="000000"/>
+                <w:sz w:val="32"/>
+                <w:szCs w:val="40"/>
+              </w:rPr>
+              <w:tab/>
+            </w:r>
+            <w:r>
+              <w:rPr>
+                <w:rFonts w:cs="BRH Malayalam Extra"/>
+                <w:color w:val="000000"/>
+                <w:szCs w:val="40"/>
+              </w:rPr>
+              <w:t>1</w:t>
+            </w:r>
+            <w:r>
+              <w:rPr>
+                <w:rFonts w:ascii="BRH Malayalam Extra" w:hAnsi="BRH Malayalam Extra" w:cs="BRH Malayalam Extra"/>
+                <w:color w:val="000000"/>
+                <w:sz w:val="32"/>
+                <w:szCs w:val="40"/>
+              </w:rPr>
+              <w:t>.</w:t>
+            </w:r>
+            <w:r>
+              <w:rPr>
+                <w:rFonts w:cs="BRH Malayalam Extra"/>
+                <w:color w:val="000000"/>
+                <w:szCs w:val="40"/>
+              </w:rPr>
+              <w:t>4</w:t>
+            </w:r>
+            <w:r>
+              <w:rPr>
+                <w:rFonts w:ascii="BRH Malayalam Extra" w:hAnsi="BRH Malayalam Extra" w:cs="BRH Malayalam Extra"/>
+                <w:color w:val="000000"/>
+                <w:sz w:val="32"/>
+                <w:szCs w:val="40"/>
+              </w:rPr>
+              <w:t>.</w:t>
+            </w:r>
+            <w:r>
+              <w:rPr>
+                <w:rFonts w:cs="BRH Malayalam Extra"/>
+                <w:color w:val="000000"/>
+                <w:szCs w:val="40"/>
+              </w:rPr>
+              <w:t>42</w:t>
+            </w:r>
+            <w:r>
+              <w:rPr>
+                <w:rFonts w:ascii="BRH Malayalam Extra" w:hAnsi="BRH Malayalam Extra" w:cs="BRH Malayalam Extra"/>
+                <w:color w:val="000000"/>
+                <w:sz w:val="32"/>
+                <w:szCs w:val="40"/>
+              </w:rPr>
+              <w:t>.</w:t>
+            </w:r>
+            <w:r>
+              <w:rPr>
+                <w:rFonts w:cs="BRH Malayalam Extra"/>
+                <w:color w:val="000000"/>
+                <w:szCs w:val="40"/>
+              </w:rPr>
+              <w:t>1</w:t>
+            </w:r>
+            <w:r>
+              <w:rPr>
+                <w:rFonts w:ascii="BRH Malayalam Extra" w:hAnsi="BRH Malayalam Extra" w:cs="BRH Malayalam Extra"/>
+                <w:color w:val="000000"/>
+                <w:sz w:val="32"/>
+                <w:szCs w:val="40"/>
+              </w:rPr>
+              <w:t>(</w:t>
+            </w:r>
+            <w:r>
+              <w:rPr>
+                <w:rFonts w:cs="BRH Malayalam Extra"/>
+                <w:color w:val="000000"/>
+                <w:szCs w:val="40"/>
+              </w:rPr>
+              <w:t>19</w:t>
+            </w:r>
+            <w:r>
+              <w:rPr>
+                <w:rFonts w:ascii="BRH Malayalam Extra" w:hAnsi="BRH Malayalam Extra" w:cs="BRH Malayalam Extra"/>
+                <w:color w:val="000000"/>
+                <w:sz w:val="32"/>
+                <w:szCs w:val="40"/>
+              </w:rPr>
+              <w:t>)-  d</w:t>
+            </w:r>
+            <w:r>
+              <w:rPr>
+                <w:rFonts w:ascii="BRH Malayalam Extra" w:hAnsi="BRH Malayalam Extra" w:cs="BRH Malayalam Extra"/>
+                <w:color w:val="000000"/>
+                <w:sz w:val="25"/>
+                <w:szCs w:val="40"/>
+              </w:rPr>
+              <w:t>–</w:t>
+            </w:r>
+            <w:r>
+              <w:rPr>
+                <w:rFonts w:ascii="BRH Malayalam Extra" w:hAnsi="BRH Malayalam Extra" w:cs="BRH Malayalam Extra"/>
+                <w:color w:val="000000"/>
+                <w:sz w:val="32"/>
+                <w:szCs w:val="40"/>
+              </w:rPr>
+              <w:t xml:space="preserve">J || </w:t>
+            </w:r>
+          </w:p>
+          <w:p>
+            <w:pPr>
+              <w:widowControl w:val="0"/>
+              <w:autoSpaceDE w:val="0"/>
+              <w:autoSpaceDN w:val="0"/>
+              <w:adjustRightInd w:val="0"/>
+              <w:spacing w:line="240" w:lineRule="auto"/>
+              <w:rPr>
+                <w:rFonts w:cs="BRH Malayalam Extra"/>
+                <w:color w:val="000000"/>
+                <w:szCs w:val="40"/>
+              </w:rPr>
+            </w:pPr>
+            <w:r>
+              <w:rPr>
+                <w:rFonts w:ascii="BRH Malayalam Extra" w:hAnsi="BRH Malayalam Extra" w:cs="BRH Malayalam Extra"/>
+                <w:color w:val="000000"/>
+                <w:sz w:val="32"/>
+                <w:szCs w:val="40"/>
+              </w:rPr>
+              <w:t>d</w:t>
+            </w:r>
+            <w:r>
+              <w:rPr>
+                <w:rFonts w:ascii="BRH Malayalam Extra" w:hAnsi="BRH Malayalam Extra" w:cs="BRH Malayalam Extra"/>
+                <w:color w:val="000000"/>
+                <w:sz w:val="25"/>
+                <w:szCs w:val="40"/>
+              </w:rPr>
+              <w:t>–</w:t>
+            </w:r>
+            <w:r>
+              <w:rPr>
+                <w:rFonts w:ascii="BRH Malayalam Extra" w:hAnsi="BRH Malayalam Extra" w:cs="BRH Malayalam Extra"/>
+                <w:color w:val="000000"/>
+                <w:sz w:val="32"/>
+                <w:szCs w:val="40"/>
+              </w:rPr>
+              <w:t xml:space="preserve"> CZy— </w:t>
+            </w:r>
+            <w:r>
+              <w:rPr>
+                <w:rFonts w:ascii="BRH Malayalam Extra" w:hAnsi="BRH Malayalam Extra" w:cs="BRH Malayalam Extra"/>
+                <w:color w:val="000000"/>
+                <w:sz w:val="32"/>
+                <w:szCs w:val="40"/>
+                <w:highlight w:val="yellow"/>
+              </w:rPr>
+              <w:t>d</w:t>
+            </w:r>
+            <w:r>
+              <w:rPr>
+                <w:rFonts w:ascii="BRH Malayalam Extra" w:hAnsi="BRH Malayalam Extra" w:cs="BRH Malayalam Extra"/>
+                <w:color w:val="000000"/>
+                <w:sz w:val="25"/>
+                <w:szCs w:val="40"/>
+              </w:rPr>
+              <w:t>–</w:t>
+            </w:r>
+            <w:r>
+              <w:rPr>
+                <w:rFonts w:ascii="BRH Malayalam Extra" w:hAnsi="BRH Malayalam Extra" w:cs="BRH Malayalam Extra"/>
+                <w:color w:val="000000"/>
+                <w:sz w:val="32"/>
+                <w:szCs w:val="40"/>
+              </w:rPr>
+              <w:t xml:space="preserve">J | </w:t>
+            </w:r>
+          </w:p>
+        </w:tc>
+        <w:tc>
+          <w:tcPr>
+            <w:tcW w:w="6520" w:type="dxa"/>
+          </w:tcPr>
+          <w:p>
+            <w:pPr>
+              <w:widowControl w:val="0"/>
+              <w:autoSpaceDE w:val="0"/>
+              <w:autoSpaceDN w:val="0"/>
+              <w:adjustRightInd w:val="0"/>
+              <w:spacing w:line="240" w:lineRule="auto"/>
+              <w:rPr>
+                <w:rFonts w:ascii="BRH Malayalam Extra" w:hAnsi="BRH Malayalam Extra" w:cs="BRH Malayalam Extra"/>
+                <w:color w:val="000000"/>
+                <w:sz w:val="32"/>
+                <w:szCs w:val="40"/>
+              </w:rPr>
+            </w:pPr>
+            <w:r>
+              <w:rPr>
+                <w:rFonts w:cs="BRH Malayalam Extra"/>
+                <w:color w:val="000000"/>
+                <w:szCs w:val="40"/>
+              </w:rPr>
+              <w:t>23</w:t>
+            </w:r>
+            <w:r>
+              <w:rPr>
+                <w:rFonts w:ascii="BRH Malayalam Extra" w:hAnsi="BRH Malayalam Extra" w:cs="BRH Malayalam Extra"/>
+                <w:color w:val="000000"/>
+                <w:sz w:val="32"/>
+                <w:szCs w:val="40"/>
+              </w:rPr>
+              <w:t>)</w:t>
+            </w:r>
+            <w:r>
+              <w:rPr>
+                <w:rFonts w:ascii="BRH Malayalam Extra" w:hAnsi="BRH Malayalam Extra" w:cs="BRH Malayalam Extra"/>
+                <w:color w:val="000000"/>
+                <w:sz w:val="32"/>
+                <w:szCs w:val="40"/>
+              </w:rPr>
+              <w:tab/>
+            </w:r>
+            <w:r>
+              <w:rPr>
+                <w:rFonts w:cs="BRH Malayalam Extra"/>
+                <w:color w:val="000000"/>
+                <w:szCs w:val="40"/>
+              </w:rPr>
+              <w:t>1</w:t>
+            </w:r>
+            <w:r>
+              <w:rPr>
+                <w:rFonts w:ascii="BRH Malayalam Extra" w:hAnsi="BRH Malayalam Extra" w:cs="BRH Malayalam Extra"/>
+                <w:color w:val="000000"/>
+                <w:sz w:val="32"/>
+                <w:szCs w:val="40"/>
+              </w:rPr>
+              <w:t>.</w:t>
+            </w:r>
+            <w:r>
+              <w:rPr>
+                <w:rFonts w:cs="BRH Malayalam Extra"/>
+                <w:color w:val="000000"/>
+                <w:szCs w:val="40"/>
+              </w:rPr>
+              <w:t>4</w:t>
+            </w:r>
+            <w:r>
+              <w:rPr>
+                <w:rFonts w:ascii="BRH Malayalam Extra" w:hAnsi="BRH Malayalam Extra" w:cs="BRH Malayalam Extra"/>
+                <w:color w:val="000000"/>
+                <w:sz w:val="32"/>
+                <w:szCs w:val="40"/>
+              </w:rPr>
+              <w:t>.</w:t>
+            </w:r>
+            <w:r>
+              <w:rPr>
+                <w:rFonts w:cs="BRH Malayalam Extra"/>
+                <w:color w:val="000000"/>
+                <w:szCs w:val="40"/>
+              </w:rPr>
+              <w:t>42</w:t>
+            </w:r>
+            <w:r>
+              <w:rPr>
+                <w:rFonts w:ascii="BRH Malayalam Extra" w:hAnsi="BRH Malayalam Extra" w:cs="BRH Malayalam Extra"/>
+                <w:color w:val="000000"/>
+                <w:sz w:val="32"/>
+                <w:szCs w:val="40"/>
+              </w:rPr>
+              <w:t>.</w:t>
+            </w:r>
+            <w:r>
+              <w:rPr>
+                <w:rFonts w:cs="BRH Malayalam Extra"/>
+                <w:color w:val="000000"/>
+                <w:szCs w:val="40"/>
+              </w:rPr>
+              <w:t>1</w:t>
+            </w:r>
+            <w:r>
+              <w:rPr>
+                <w:rFonts w:ascii="BRH Malayalam Extra" w:hAnsi="BRH Malayalam Extra" w:cs="BRH Malayalam Extra"/>
+                <w:color w:val="000000"/>
+                <w:sz w:val="32"/>
+                <w:szCs w:val="40"/>
+              </w:rPr>
+              <w:t>(</w:t>
+            </w:r>
+            <w:r>
+              <w:rPr>
+                <w:rFonts w:cs="BRH Malayalam Extra"/>
+                <w:color w:val="000000"/>
+                <w:szCs w:val="40"/>
+              </w:rPr>
+              <w:t>19</w:t>
+            </w:r>
+            <w:r>
+              <w:rPr>
+                <w:rFonts w:ascii="BRH Malayalam Extra" w:hAnsi="BRH Malayalam Extra" w:cs="BRH Malayalam Extra"/>
+                <w:color w:val="000000"/>
+                <w:sz w:val="32"/>
+                <w:szCs w:val="40"/>
+              </w:rPr>
+              <w:t>)-  d</w:t>
+            </w:r>
+            <w:r>
+              <w:rPr>
+                <w:rFonts w:ascii="BRH Malayalam Extra" w:hAnsi="BRH Malayalam Extra" w:cs="BRH Malayalam Extra"/>
+                <w:color w:val="000000"/>
+                <w:sz w:val="25"/>
+                <w:szCs w:val="40"/>
+              </w:rPr>
+              <w:t>–</w:t>
+            </w:r>
+            <w:r>
+              <w:rPr>
+                <w:rFonts w:ascii="BRH Malayalam Extra" w:hAnsi="BRH Malayalam Extra" w:cs="BRH Malayalam Extra"/>
+                <w:color w:val="000000"/>
+                <w:sz w:val="32"/>
+                <w:szCs w:val="40"/>
+              </w:rPr>
+              <w:t>J || (</w:t>
+            </w:r>
+            <w:r>
+              <w:rPr>
+                <w:rFonts w:cs="BRH Malayalam Extra"/>
+                <w:color w:val="000000"/>
+                <w:szCs w:val="40"/>
+              </w:rPr>
+              <w:t>GS</w:t>
+            </w:r>
+            <w:r>
+              <w:rPr>
+                <w:rFonts w:ascii="BRH Malayalam Extra" w:hAnsi="BRH Malayalam Extra" w:cs="BRH Malayalam Extra"/>
+                <w:color w:val="000000"/>
+                <w:sz w:val="32"/>
+                <w:szCs w:val="40"/>
+              </w:rPr>
+              <w:t>-</w:t>
+            </w:r>
+            <w:r>
+              <w:rPr>
+                <w:rFonts w:cs="BRH Malayalam Extra"/>
+                <w:color w:val="000000"/>
+                <w:szCs w:val="40"/>
+              </w:rPr>
+              <w:t>1</w:t>
+            </w:r>
+            <w:r>
+              <w:rPr>
+                <w:rFonts w:ascii="BRH Malayalam Extra" w:hAnsi="BRH Malayalam Extra" w:cs="BRH Malayalam Extra"/>
+                <w:color w:val="000000"/>
+                <w:sz w:val="32"/>
+                <w:szCs w:val="40"/>
+              </w:rPr>
+              <w:t>.</w:t>
+            </w:r>
+            <w:r>
+              <w:rPr>
+                <w:rFonts w:cs="BRH Malayalam Extra"/>
+                <w:color w:val="000000"/>
+                <w:szCs w:val="40"/>
+              </w:rPr>
+              <w:t>4</w:t>
+            </w:r>
+            <w:r>
+              <w:rPr>
+                <w:rFonts w:ascii="BRH Malayalam Extra" w:hAnsi="BRH Malayalam Extra" w:cs="BRH Malayalam Extra"/>
+                <w:color w:val="000000"/>
+                <w:sz w:val="32"/>
+                <w:szCs w:val="40"/>
+              </w:rPr>
+              <w:t>-</w:t>
+            </w:r>
+            <w:r>
+              <w:rPr>
+                <w:rFonts w:cs="BRH Malayalam Extra"/>
+                <w:color w:val="000000"/>
+                <w:szCs w:val="40"/>
+              </w:rPr>
+              <w:t>27</w:t>
+            </w:r>
+            <w:r>
+              <w:rPr>
+                <w:rFonts w:ascii="BRH Malayalam Extra" w:hAnsi="BRH Malayalam Extra" w:cs="BRH Malayalam Extra"/>
+                <w:color w:val="000000"/>
+                <w:sz w:val="32"/>
+                <w:szCs w:val="40"/>
+              </w:rPr>
+              <w:t>)</w:t>
+            </w:r>
+          </w:p>
+          <w:p>
+            <w:pPr>
+              <w:widowControl w:val="0"/>
+              <w:autoSpaceDE w:val="0"/>
+              <w:autoSpaceDN w:val="0"/>
+              <w:adjustRightInd w:val="0"/>
+              <w:spacing w:line="240" w:lineRule="auto"/>
+              <w:rPr>
+                <w:rFonts w:cs="BRH Malayalam Extra"/>
+                <w:color w:val="000000"/>
+                <w:szCs w:val="40"/>
+              </w:rPr>
+            </w:pPr>
+            <w:r>
+              <w:rPr>
+                <w:rFonts w:ascii="BRH Malayalam Extra" w:hAnsi="BRH Malayalam Extra" w:cs="BRH Malayalam Extra"/>
+                <w:color w:val="000000"/>
+                <w:sz w:val="32"/>
+                <w:szCs w:val="40"/>
+              </w:rPr>
+              <w:t>d</w:t>
+            </w:r>
+            <w:r>
+              <w:rPr>
+                <w:rFonts w:ascii="BRH Malayalam Extra" w:hAnsi="BRH Malayalam Extra" w:cs="BRH Malayalam Extra"/>
+                <w:color w:val="000000"/>
+                <w:sz w:val="25"/>
+                <w:szCs w:val="40"/>
+              </w:rPr>
+              <w:t>–</w:t>
+            </w:r>
+            <w:r>
+              <w:rPr>
+                <w:rFonts w:ascii="BRH Malayalam Extra" w:hAnsi="BRH Malayalam Extra" w:cs="BRH Malayalam Extra"/>
+                <w:color w:val="000000"/>
+                <w:sz w:val="32"/>
+                <w:szCs w:val="40"/>
+              </w:rPr>
+              <w:t xml:space="preserve"> CZy— </w:t>
+            </w:r>
+            <w:r>
+              <w:rPr>
+                <w:rFonts w:ascii="BRH Malayalam Extra" w:hAnsi="BRH Malayalam Extra" w:cs="BRH Malayalam Extra"/>
+                <w:color w:val="000000"/>
+                <w:sz w:val="32"/>
+                <w:szCs w:val="40"/>
+                <w:highlight w:val="green"/>
+              </w:rPr>
+              <w:t>d</w:t>
+            </w:r>
+            <w:r>
+              <w:rPr>
+                <w:rFonts w:ascii="BRH Malayalam Extra" w:hAnsi="BRH Malayalam Extra" w:cs="BRH Malayalam Extra"/>
+                <w:color w:val="000000"/>
+                <w:sz w:val="32"/>
+                <w:szCs w:val="40"/>
+              </w:rPr>
+              <w:t xml:space="preserve">J | </w:t>
+            </w:r>
           </w:p>
         </w:tc>
       </w:tr>
@@ -1721,6 +2196,7 @@
                 <w:sz w:val="32"/>
                 <w:szCs w:val="40"/>
               </w:rPr>
+              <w:lastRenderedPageBreak/>
               <w:t>Zûx</w:t>
             </w:r>
             <w:r>
@@ -2142,7 +2618,6 @@
                 <w:sz w:val="32"/>
                 <w:szCs w:val="40"/>
               </w:rPr>
-              <w:lastRenderedPageBreak/>
               <w:t>s¡</w:t>
             </w:r>
             <w:r>
@@ -3164,6 +3639,7 @@
                 <w:sz w:val="32"/>
                 <w:szCs w:val="40"/>
               </w:rPr>
+              <w:lastRenderedPageBreak/>
               <w:t>Zûx</w:t>
             </w:r>
             <w:r>
@@ -3669,7 +4145,6 @@
                 <w:sz w:val="32"/>
                 <w:szCs w:val="40"/>
               </w:rPr>
-              <w:lastRenderedPageBreak/>
               <w:t>s¡</w:t>
             </w:r>
             <w:r>
@@ -4488,18 +4963,8 @@
                 <w:sz w:val="32"/>
                 <w:szCs w:val="40"/>
               </w:rPr>
-              <w:t>æ¢k¢</w:t>
-            </w:r>
-            <w:proofErr w:type="gramStart"/>
-            <w:r>
-              <w:rPr>
-                <w:rFonts w:ascii="BRH Malayalam Extra" w:hAnsi="BRH Malayalam Extra" w:cs="BRH Malayalam Extra"/>
-                <w:sz w:val="32"/>
-                <w:szCs w:val="40"/>
-              </w:rPr>
-              <w:t>˜(</w:t>
-            </w:r>
-            <w:proofErr w:type="gramEnd"/>
+              <w:t>æ¢k¢˜(</w:t>
+            </w:r>
             <w:r>
               <w:rPr>
                 <w:rFonts w:cs="BRH Malayalam Extra"/>
@@ -4757,18 +5222,8 @@
                 <w:sz w:val="32"/>
                 <w:szCs w:val="40"/>
               </w:rPr>
-              <w:t>æ¢k¢</w:t>
-            </w:r>
-            <w:proofErr w:type="gramStart"/>
-            <w:r>
-              <w:rPr>
-                <w:rFonts w:ascii="BRH Malayalam Extra" w:hAnsi="BRH Malayalam Extra" w:cs="BRH Malayalam Extra"/>
-                <w:sz w:val="32"/>
-                <w:szCs w:val="40"/>
-              </w:rPr>
-              <w:t>˜(</w:t>
-            </w:r>
-            <w:proofErr w:type="gramEnd"/>
+              <w:t>æ¢k¢˜(</w:t>
+            </w:r>
             <w:r>
               <w:rPr>
                 <w:rFonts w:cs="BRH Malayalam Extra"/>
@@ -4776,31 +5231,21 @@
               </w:rPr>
               <w:t>1</w:t>
             </w:r>
-            <w:proofErr w:type="gramStart"/>
-            <w:r>
-              <w:rPr>
-                <w:rFonts w:ascii="BRH Malayalam Extra" w:hAnsi="BRH Malayalam Extra" w:cs="BRH Malayalam Extra"/>
-                <w:sz w:val="26"/>
-                <w:szCs w:val="40"/>
-              </w:rPr>
-              <w:t>–</w:t>
-            </w:r>
-            <w:r>
-              <w:rPr>
-                <w:rFonts w:ascii="BRH Malayalam Extra" w:hAnsi="BRH Malayalam Extra" w:cs="BRH Malayalam Extra"/>
-                <w:sz w:val="32"/>
-                <w:szCs w:val="40"/>
-              </w:rPr>
-              <w:t>)ªp</w:t>
-            </w:r>
-            <w:proofErr w:type="gramEnd"/>
-            <w:r>
-              <w:rPr>
-                <w:rFonts w:ascii="BRH Malayalam Extra" w:hAnsi="BRH Malayalam Extra" w:cs="BRH Malayalam Extra"/>
-                <w:sz w:val="32"/>
-                <w:szCs w:val="40"/>
-              </w:rPr>
-              <w:t>—ræû</w:t>
+            <w:r>
+              <w:rPr>
+                <w:rFonts w:ascii="BRH Malayalam Extra" w:hAnsi="BRH Malayalam Extra" w:cs="BRH Malayalam Extra"/>
+                <w:sz w:val="26"/>
+                <w:szCs w:val="40"/>
+              </w:rPr>
+              <w:t>–</w:t>
+            </w:r>
+            <w:r>
+              <w:rPr>
+                <w:rFonts w:ascii="BRH Malayalam Extra" w:hAnsi="BRH Malayalam Extra" w:cs="BRH Malayalam Extra"/>
+                <w:sz w:val="32"/>
+                <w:szCs w:val="40"/>
+              </w:rPr>
+              <w:t>)ªp—ræû</w:t>
             </w:r>
             <w:r>
               <w:rPr>
@@ -5160,18 +5605,8 @@
                 <w:sz w:val="32"/>
                 <w:szCs w:val="40"/>
               </w:rPr>
-              <w:t>k¢</w:t>
-            </w:r>
-            <w:proofErr w:type="gramStart"/>
-            <w:r>
-              <w:rPr>
-                <w:rFonts w:ascii="BRH Malayalam Extra" w:hAnsi="BRH Malayalam Extra" w:cs="BRH Malayalam Extra"/>
-                <w:sz w:val="32"/>
-                <w:szCs w:val="40"/>
-              </w:rPr>
-              <w:t>˜(</w:t>
-            </w:r>
-            <w:proofErr w:type="gramEnd"/>
+              <w:t>k¢˜(</w:t>
+            </w:r>
             <w:r>
               <w:rPr>
                 <w:rFonts w:cs="BRH Malayalam Extra"/>
@@ -5179,31 +5614,21 @@
               </w:rPr>
               <w:t>1</w:t>
             </w:r>
-            <w:proofErr w:type="gramStart"/>
-            <w:r>
-              <w:rPr>
-                <w:rFonts w:ascii="BRH Malayalam Extra" w:hAnsi="BRH Malayalam Extra" w:cs="BRH Malayalam Extra"/>
-                <w:sz w:val="26"/>
-                <w:szCs w:val="40"/>
-              </w:rPr>
-              <w:t>–</w:t>
-            </w:r>
-            <w:r>
-              <w:rPr>
-                <w:rFonts w:ascii="BRH Malayalam Extra" w:hAnsi="BRH Malayalam Extra" w:cs="BRH Malayalam Extra"/>
-                <w:sz w:val="32"/>
-                <w:szCs w:val="40"/>
-              </w:rPr>
-              <w:t>)ªp</w:t>
-            </w:r>
-            <w:proofErr w:type="gramEnd"/>
-            <w:r>
-              <w:rPr>
-                <w:rFonts w:ascii="BRH Malayalam Extra" w:hAnsi="BRH Malayalam Extra" w:cs="BRH Malayalam Extra"/>
-                <w:sz w:val="32"/>
-                <w:szCs w:val="40"/>
-              </w:rPr>
-              <w:t xml:space="preserve">—ræ¡ Zûx Zûx </w:t>
+            <w:r>
+              <w:rPr>
+                <w:rFonts w:ascii="BRH Malayalam Extra" w:hAnsi="BRH Malayalam Extra" w:cs="BRH Malayalam Extra"/>
+                <w:sz w:val="26"/>
+                <w:szCs w:val="40"/>
+              </w:rPr>
+              <w:t>–</w:t>
+            </w:r>
+            <w:r>
+              <w:rPr>
+                <w:rFonts w:ascii="BRH Malayalam Extra" w:hAnsi="BRH Malayalam Extra" w:cs="BRH Malayalam Extra"/>
+                <w:sz w:val="32"/>
+                <w:szCs w:val="40"/>
+              </w:rPr>
+              <w:t xml:space="preserve">)ªp—ræ¡ Zûx Zûx </w:t>
             </w:r>
           </w:p>
           <w:p>
@@ -5448,18 +5873,8 @@
                 <w:sz w:val="32"/>
                 <w:szCs w:val="40"/>
               </w:rPr>
-              <w:t>k¢</w:t>
-            </w:r>
-            <w:proofErr w:type="gramStart"/>
-            <w:r>
-              <w:rPr>
-                <w:rFonts w:ascii="BRH Malayalam Extra" w:hAnsi="BRH Malayalam Extra" w:cs="BRH Malayalam Extra"/>
-                <w:sz w:val="32"/>
-                <w:szCs w:val="40"/>
-              </w:rPr>
-              <w:t>˜(</w:t>
-            </w:r>
-            <w:proofErr w:type="gramEnd"/>
+              <w:t>k¢˜(</w:t>
+            </w:r>
             <w:r>
               <w:rPr>
                 <w:rFonts w:cs="BRH Malayalam Extra"/>
@@ -5467,31 +5882,21 @@
               </w:rPr>
               <w:t>1</w:t>
             </w:r>
-            <w:proofErr w:type="gramStart"/>
-            <w:r>
-              <w:rPr>
-                <w:rFonts w:ascii="BRH Malayalam Extra" w:hAnsi="BRH Malayalam Extra" w:cs="BRH Malayalam Extra"/>
-                <w:sz w:val="26"/>
-                <w:szCs w:val="40"/>
-              </w:rPr>
-              <w:t>–</w:t>
-            </w:r>
-            <w:r>
-              <w:rPr>
-                <w:rFonts w:ascii="BRH Malayalam Extra" w:hAnsi="BRH Malayalam Extra" w:cs="BRH Malayalam Extra"/>
-                <w:sz w:val="32"/>
-                <w:szCs w:val="40"/>
-              </w:rPr>
-              <w:t>)ªp</w:t>
-            </w:r>
-            <w:proofErr w:type="gramEnd"/>
-            <w:r>
-              <w:rPr>
-                <w:rFonts w:ascii="BRH Malayalam Extra" w:hAnsi="BRH Malayalam Extra" w:cs="BRH Malayalam Extra"/>
-                <w:sz w:val="32"/>
-                <w:szCs w:val="40"/>
-              </w:rPr>
-              <w:t>—ræû</w:t>
+            <w:r>
+              <w:rPr>
+                <w:rFonts w:ascii="BRH Malayalam Extra" w:hAnsi="BRH Malayalam Extra" w:cs="BRH Malayalam Extra"/>
+                <w:sz w:val="26"/>
+                <w:szCs w:val="40"/>
+              </w:rPr>
+              <w:t>–</w:t>
+            </w:r>
+            <w:r>
+              <w:rPr>
+                <w:rFonts w:ascii="BRH Malayalam Extra" w:hAnsi="BRH Malayalam Extra" w:cs="BRH Malayalam Extra"/>
+                <w:sz w:val="32"/>
+                <w:szCs w:val="40"/>
+              </w:rPr>
+              <w:t>)ªp—ræû</w:t>
             </w:r>
             <w:r>
               <w:rPr>
@@ -5625,6 +6030,7 @@
                 <w:rFonts w:cs="BRH Malayalam Extra"/>
                 <w:szCs w:val="40"/>
               </w:rPr>
+              <w:lastRenderedPageBreak/>
               <w:t>47</w:t>
             </w:r>
             <w:r>
@@ -5891,18 +6297,8 @@
                 <w:sz w:val="32"/>
                 <w:szCs w:val="40"/>
               </w:rPr>
-              <w:t>k¢</w:t>
-            </w:r>
-            <w:proofErr w:type="gramStart"/>
-            <w:r>
-              <w:rPr>
-                <w:rFonts w:ascii="BRH Malayalam Extra" w:hAnsi="BRH Malayalam Extra" w:cs="BRH Malayalam Extra"/>
-                <w:sz w:val="32"/>
-                <w:szCs w:val="40"/>
-              </w:rPr>
-              <w:t>˜(</w:t>
-            </w:r>
-            <w:proofErr w:type="gramEnd"/>
+              <w:t>k¢˜(</w:t>
+            </w:r>
             <w:r>
               <w:rPr>
                 <w:rFonts w:cs="BRH Malayalam Extra"/>
@@ -5910,31 +6306,21 @@
               </w:rPr>
               <w:t>1</w:t>
             </w:r>
-            <w:proofErr w:type="gramStart"/>
-            <w:r>
-              <w:rPr>
-                <w:rFonts w:ascii="BRH Malayalam Extra" w:hAnsi="BRH Malayalam Extra" w:cs="BRH Malayalam Extra"/>
-                <w:sz w:val="26"/>
-                <w:szCs w:val="40"/>
-              </w:rPr>
-              <w:t>–</w:t>
-            </w:r>
-            <w:r>
-              <w:rPr>
-                <w:rFonts w:ascii="BRH Malayalam Extra" w:hAnsi="BRH Malayalam Extra" w:cs="BRH Malayalam Extra"/>
-                <w:sz w:val="32"/>
-                <w:szCs w:val="40"/>
-              </w:rPr>
-              <w:t>)ªp</w:t>
-            </w:r>
-            <w:proofErr w:type="gramEnd"/>
-            <w:r>
-              <w:rPr>
-                <w:rFonts w:ascii="BRH Malayalam Extra" w:hAnsi="BRH Malayalam Extra" w:cs="BRH Malayalam Extra"/>
-                <w:sz w:val="32"/>
-                <w:szCs w:val="40"/>
-              </w:rPr>
-              <w:t>—ræ¡ Zûx Zûx „ræ¢—k¡ |</w:t>
+            <w:r>
+              <w:rPr>
+                <w:rFonts w:ascii="BRH Malayalam Extra" w:hAnsi="BRH Malayalam Extra" w:cs="BRH Malayalam Extra"/>
+                <w:sz w:val="26"/>
+                <w:szCs w:val="40"/>
+              </w:rPr>
+              <w:t>–</w:t>
+            </w:r>
+            <w:r>
+              <w:rPr>
+                <w:rFonts w:ascii="BRH Malayalam Extra" w:hAnsi="BRH Malayalam Extra" w:cs="BRH Malayalam Extra"/>
+                <w:sz w:val="32"/>
+                <w:szCs w:val="40"/>
+              </w:rPr>
+              <w:t>)ªp—ræ¡ Zûx Zûx „ræ¢—k¡ |</w:t>
             </w:r>
           </w:p>
           <w:p>
@@ -6157,18 +6543,8 @@
                 <w:sz w:val="32"/>
                 <w:szCs w:val="40"/>
               </w:rPr>
-              <w:t>k¢</w:t>
-            </w:r>
-            <w:proofErr w:type="gramStart"/>
-            <w:r>
-              <w:rPr>
-                <w:rFonts w:ascii="BRH Malayalam Extra" w:hAnsi="BRH Malayalam Extra" w:cs="BRH Malayalam Extra"/>
-                <w:sz w:val="32"/>
-                <w:szCs w:val="40"/>
-              </w:rPr>
-              <w:t>˜(</w:t>
-            </w:r>
-            <w:proofErr w:type="gramEnd"/>
+              <w:t>k¢˜(</w:t>
+            </w:r>
             <w:r>
               <w:rPr>
                 <w:rFonts w:cs="BRH Malayalam Extra"/>
@@ -6176,31 +6552,21 @@
               </w:rPr>
               <w:t>1</w:t>
             </w:r>
-            <w:proofErr w:type="gramStart"/>
-            <w:r>
-              <w:rPr>
-                <w:rFonts w:ascii="BRH Malayalam Extra" w:hAnsi="BRH Malayalam Extra" w:cs="BRH Malayalam Extra"/>
-                <w:sz w:val="26"/>
-                <w:szCs w:val="40"/>
-              </w:rPr>
-              <w:t>–</w:t>
-            </w:r>
-            <w:r>
-              <w:rPr>
-                <w:rFonts w:ascii="BRH Malayalam Extra" w:hAnsi="BRH Malayalam Extra" w:cs="BRH Malayalam Extra"/>
-                <w:sz w:val="32"/>
-                <w:szCs w:val="40"/>
-              </w:rPr>
-              <w:t>)ªp</w:t>
-            </w:r>
-            <w:proofErr w:type="gramEnd"/>
-            <w:r>
-              <w:rPr>
-                <w:rFonts w:ascii="BRH Malayalam Extra" w:hAnsi="BRH Malayalam Extra" w:cs="BRH Malayalam Extra"/>
-                <w:sz w:val="32"/>
-                <w:szCs w:val="40"/>
-              </w:rPr>
-              <w:t>—ræû</w:t>
+            <w:r>
+              <w:rPr>
+                <w:rFonts w:ascii="BRH Malayalam Extra" w:hAnsi="BRH Malayalam Extra" w:cs="BRH Malayalam Extra"/>
+                <w:sz w:val="26"/>
+                <w:szCs w:val="40"/>
+              </w:rPr>
+              <w:t>–</w:t>
+            </w:r>
+            <w:r>
+              <w:rPr>
+                <w:rFonts w:ascii="BRH Malayalam Extra" w:hAnsi="BRH Malayalam Extra" w:cs="BRH Malayalam Extra"/>
+                <w:sz w:val="32"/>
+                <w:szCs w:val="40"/>
+              </w:rPr>
+              <w:t>)ªp—ræû</w:t>
             </w:r>
             <w:r>
               <w:rPr>
@@ -6641,18 +7007,8 @@
                 <w:sz w:val="32"/>
                 <w:szCs w:val="40"/>
               </w:rPr>
-              <w:t>k¢</w:t>
-            </w:r>
-            <w:proofErr w:type="gramStart"/>
-            <w:r>
-              <w:rPr>
-                <w:rFonts w:ascii="BRH Malayalam Extra" w:hAnsi="BRH Malayalam Extra" w:cs="BRH Malayalam Extra"/>
-                <w:sz w:val="32"/>
-                <w:szCs w:val="40"/>
-              </w:rPr>
-              <w:t>˜(</w:t>
-            </w:r>
-            <w:proofErr w:type="gramEnd"/>
+              <w:t>k¢˜(</w:t>
+            </w:r>
             <w:r>
               <w:rPr>
                 <w:rFonts w:cs="BRH Malayalam Extra"/>
@@ -6660,31 +7016,21 @@
               </w:rPr>
               <w:t>1</w:t>
             </w:r>
-            <w:proofErr w:type="gramStart"/>
-            <w:r>
-              <w:rPr>
-                <w:rFonts w:ascii="BRH Malayalam Extra" w:hAnsi="BRH Malayalam Extra" w:cs="BRH Malayalam Extra"/>
-                <w:sz w:val="26"/>
-                <w:szCs w:val="40"/>
-              </w:rPr>
-              <w:t>–</w:t>
-            </w:r>
-            <w:r>
-              <w:rPr>
-                <w:rFonts w:ascii="BRH Malayalam Extra" w:hAnsi="BRH Malayalam Extra" w:cs="BRH Malayalam Extra"/>
-                <w:sz w:val="32"/>
-                <w:szCs w:val="40"/>
-              </w:rPr>
-              <w:t>)ªp</w:t>
-            </w:r>
-            <w:proofErr w:type="gramEnd"/>
-            <w:r>
-              <w:rPr>
-                <w:rFonts w:ascii="BRH Malayalam Extra" w:hAnsi="BRH Malayalam Extra" w:cs="BRH Malayalam Extra"/>
-                <w:sz w:val="32"/>
-                <w:szCs w:val="40"/>
-              </w:rPr>
-              <w:t xml:space="preserve">—ræ¡ Zûx Zûx „ræ¢—k¡ | </w:t>
+            <w:r>
+              <w:rPr>
+                <w:rFonts w:ascii="BRH Malayalam Extra" w:hAnsi="BRH Malayalam Extra" w:cs="BRH Malayalam Extra"/>
+                <w:sz w:val="26"/>
+                <w:szCs w:val="40"/>
+              </w:rPr>
+              <w:t>–</w:t>
+            </w:r>
+            <w:r>
+              <w:rPr>
+                <w:rFonts w:ascii="BRH Malayalam Extra" w:hAnsi="BRH Malayalam Extra" w:cs="BRH Malayalam Extra"/>
+                <w:sz w:val="32"/>
+                <w:szCs w:val="40"/>
+              </w:rPr>
+              <w:t xml:space="preserve">)ªp—ræ¡ Zûx Zûx „ræ¢—k¡ | </w:t>
             </w:r>
           </w:p>
           <w:p>
@@ -6907,18 +7253,8 @@
                 <w:sz w:val="32"/>
                 <w:szCs w:val="40"/>
               </w:rPr>
-              <w:t>k¢</w:t>
-            </w:r>
-            <w:proofErr w:type="gramStart"/>
-            <w:r>
-              <w:rPr>
-                <w:rFonts w:ascii="BRH Malayalam Extra" w:hAnsi="BRH Malayalam Extra" w:cs="BRH Malayalam Extra"/>
-                <w:sz w:val="32"/>
-                <w:szCs w:val="40"/>
-              </w:rPr>
-              <w:t>˜(</w:t>
-            </w:r>
-            <w:proofErr w:type="gramEnd"/>
+              <w:t>k¢˜(</w:t>
+            </w:r>
             <w:r>
               <w:rPr>
                 <w:rFonts w:cs="BRH Malayalam Extra"/>
@@ -6926,31 +7262,21 @@
               </w:rPr>
               <w:t>1</w:t>
             </w:r>
-            <w:proofErr w:type="gramStart"/>
-            <w:r>
-              <w:rPr>
-                <w:rFonts w:ascii="BRH Malayalam Extra" w:hAnsi="BRH Malayalam Extra" w:cs="BRH Malayalam Extra"/>
-                <w:sz w:val="26"/>
-                <w:szCs w:val="40"/>
-              </w:rPr>
-              <w:t>–</w:t>
-            </w:r>
-            <w:r>
-              <w:rPr>
-                <w:rFonts w:ascii="BRH Malayalam Extra" w:hAnsi="BRH Malayalam Extra" w:cs="BRH Malayalam Extra"/>
-                <w:sz w:val="32"/>
-                <w:szCs w:val="40"/>
-              </w:rPr>
-              <w:t>)ªp</w:t>
-            </w:r>
-            <w:proofErr w:type="gramEnd"/>
-            <w:r>
-              <w:rPr>
-                <w:rFonts w:ascii="BRH Malayalam Extra" w:hAnsi="BRH Malayalam Extra" w:cs="BRH Malayalam Extra"/>
-                <w:sz w:val="32"/>
-                <w:szCs w:val="40"/>
-              </w:rPr>
-              <w:t>—ræû</w:t>
+            <w:r>
+              <w:rPr>
+                <w:rFonts w:ascii="BRH Malayalam Extra" w:hAnsi="BRH Malayalam Extra" w:cs="BRH Malayalam Extra"/>
+                <w:sz w:val="26"/>
+                <w:szCs w:val="40"/>
+              </w:rPr>
+              <w:t>–</w:t>
+            </w:r>
+            <w:r>
+              <w:rPr>
+                <w:rFonts w:ascii="BRH Malayalam Extra" w:hAnsi="BRH Malayalam Extra" w:cs="BRH Malayalam Extra"/>
+                <w:sz w:val="32"/>
+                <w:szCs w:val="40"/>
+              </w:rPr>
+              <w:t>)ªp—ræû</w:t>
             </w:r>
             <w:r>
               <w:rPr>
@@ -7101,7 +7427,6 @@
                 <w:szCs w:val="40"/>
                 <w:lang w:val="it-IT"/>
               </w:rPr>
-              <w:lastRenderedPageBreak/>
               <w:t>22</w:t>
             </w:r>
             <w:r>
@@ -8186,18 +8511,8 @@
                 <w:sz w:val="32"/>
                 <w:szCs w:val="40"/>
               </w:rPr>
-              <w:t>sª¥ex˜ „sõ(³</w:t>
-            </w:r>
-            <w:proofErr w:type="gramStart"/>
-            <w:r>
-              <w:rPr>
-                <w:rFonts w:ascii="BRH Malayalam Extra" w:hAnsi="BRH Malayalam Extra" w:cs="BRH Malayalam Extra"/>
-                <w:sz w:val="32"/>
-                <w:szCs w:val="40"/>
-              </w:rPr>
-              <w:t>§)tsð</w:t>
-            </w:r>
-            <w:proofErr w:type="gramEnd"/>
+              <w:t>sª¥ex˜ „sõ(³§)tsð</w:t>
+            </w:r>
             <w:r>
               <w:rPr>
                 <w:rFonts w:ascii="BRH Malayalam Extra" w:hAnsi="BRH Malayalam Extra" w:cs="BRH Malayalam Extra"/>
@@ -8234,18 +8549,8 @@
                 <w:sz w:val="32"/>
                 <w:szCs w:val="40"/>
               </w:rPr>
-              <w:t>jx(³§</w:t>
-            </w:r>
-            <w:proofErr w:type="gramStart"/>
-            <w:r>
-              <w:rPr>
-                <w:rFonts w:ascii="BRH Malayalam Extra" w:hAnsi="BRH Malayalam Extra" w:cs="BRH Malayalam Extra"/>
-                <w:sz w:val="32"/>
-                <w:szCs w:val="40"/>
-              </w:rPr>
-              <w:t>—)tsð</w:t>
-            </w:r>
-            <w:proofErr w:type="gramEnd"/>
+              <w:t>jx(³§—)tsð</w:t>
+            </w:r>
             <w:r>
               <w:rPr>
                 <w:rFonts w:ascii="BRH Malayalam Extra" w:hAnsi="BRH Malayalam Extra" w:cs="BRH Malayalam Extra"/>
@@ -8363,18 +8668,8 @@
                 <w:sz w:val="32"/>
                 <w:szCs w:val="40"/>
               </w:rPr>
-              <w:t>sª¥ex˜ „sõ(³</w:t>
-            </w:r>
-            <w:proofErr w:type="gramStart"/>
-            <w:r>
-              <w:rPr>
-                <w:rFonts w:ascii="BRH Malayalam Extra" w:hAnsi="BRH Malayalam Extra" w:cs="BRH Malayalam Extra"/>
-                <w:sz w:val="32"/>
-                <w:szCs w:val="40"/>
-              </w:rPr>
-              <w:t>§)tsð</w:t>
-            </w:r>
-            <w:proofErr w:type="gramEnd"/>
+              <w:t>sª¥ex˜ „sõ(³§)tsð</w:t>
+            </w:r>
             <w:r>
               <w:rPr>
                 <w:rFonts w:ascii="BRH Malayalam Extra" w:hAnsi="BRH Malayalam Extra" w:cs="BRH Malayalam Extra"/>
@@ -8815,18 +9110,8 @@
                 <w:sz w:val="32"/>
                 <w:szCs w:val="40"/>
               </w:rPr>
-              <w:t>sª¥ex˜ „sõ(³</w:t>
-            </w:r>
-            <w:proofErr w:type="gramStart"/>
-            <w:r>
-              <w:rPr>
-                <w:rFonts w:ascii="BRH Malayalam Extra" w:hAnsi="BRH Malayalam Extra" w:cs="BRH Malayalam Extra"/>
-                <w:sz w:val="32"/>
-                <w:szCs w:val="40"/>
-              </w:rPr>
-              <w:t>§)tsð</w:t>
-            </w:r>
-            <w:proofErr w:type="gramEnd"/>
+              <w:t>sª¥ex˜ „sõ(³§)tsð</w:t>
+            </w:r>
             <w:r>
               <w:rPr>
                 <w:rFonts w:ascii="BRH Malayalam Extra" w:hAnsi="BRH Malayalam Extra" w:cs="BRH Malayalam Extra"/>
@@ -8863,18 +9148,8 @@
                 <w:sz w:val="32"/>
                 <w:szCs w:val="40"/>
               </w:rPr>
-              <w:t>jx(³§</w:t>
-            </w:r>
-            <w:proofErr w:type="gramStart"/>
-            <w:r>
-              <w:rPr>
-                <w:rFonts w:ascii="BRH Malayalam Extra" w:hAnsi="BRH Malayalam Extra" w:cs="BRH Malayalam Extra"/>
-                <w:sz w:val="32"/>
-                <w:szCs w:val="40"/>
-              </w:rPr>
-              <w:t>—)tsð</w:t>
-            </w:r>
-            <w:proofErr w:type="gramEnd"/>
+              <w:t>jx(³§—)tsð</w:t>
+            </w:r>
             <w:r>
               <w:rPr>
                 <w:rFonts w:ascii="BRH Malayalam Extra" w:hAnsi="BRH Malayalam Extra" w:cs="BRH Malayalam Extra"/>
@@ -8992,18 +9267,8 @@
                 <w:sz w:val="32"/>
                 <w:szCs w:val="40"/>
               </w:rPr>
-              <w:t>sª¥ex˜ „sõ(³</w:t>
-            </w:r>
-            <w:proofErr w:type="gramStart"/>
-            <w:r>
-              <w:rPr>
-                <w:rFonts w:ascii="BRH Malayalam Extra" w:hAnsi="BRH Malayalam Extra" w:cs="BRH Malayalam Extra"/>
-                <w:sz w:val="32"/>
-                <w:szCs w:val="40"/>
-              </w:rPr>
-              <w:t>§)tsð</w:t>
-            </w:r>
-            <w:proofErr w:type="gramEnd"/>
+              <w:t>sª¥ex˜ „sõ(³§)tsð</w:t>
+            </w:r>
             <w:r>
               <w:rPr>
                 <w:rFonts w:ascii="BRH Malayalam Extra" w:hAnsi="BRH Malayalam Extra" w:cs="BRH Malayalam Extra"/>
@@ -9238,6 +9503,7 @@
                 <w:rFonts w:cs="BRH Malayalam Extra"/>
                 <w:szCs w:val="40"/>
               </w:rPr>
+              <w:lastRenderedPageBreak/>
               <w:t>23</w:t>
             </w:r>
             <w:r>
@@ -9429,6 +9695,7 @@
                 <w:rFonts w:cs="BRH Malayalam Extra"/>
                 <w:szCs w:val="40"/>
               </w:rPr>
+              <w:lastRenderedPageBreak/>
               <w:t>64</w:t>
             </w:r>
             <w:r>
@@ -10029,7 +10296,6 @@
                 <w:szCs w:val="40"/>
                 <w:highlight w:val="yellow"/>
               </w:rPr>
-              <w:lastRenderedPageBreak/>
               <w:t>s¡</w:t>
             </w:r>
             <w:r>
@@ -11371,7 +11637,6 @@
                 <w:szCs w:val="40"/>
                 <w:lang w:val="it-IT"/>
               </w:rPr>
-              <w:lastRenderedPageBreak/>
               <w:t>54</w:t>
             </w:r>
             <w:r>
@@ -11671,7 +11936,6 @@
                 <w:highlight w:val="green"/>
                 <w:lang w:val="it-IT"/>
               </w:rPr>
-              <w:lastRenderedPageBreak/>
               <w:t>s¡—i</w:t>
             </w:r>
             <w:r>
@@ -13950,7 +14214,6 @@
                 <w:sz w:val="32"/>
                 <w:szCs w:val="40"/>
               </w:rPr>
-              <w:lastRenderedPageBreak/>
               <w:t>qy</w:t>
             </w:r>
             <w:r>
@@ -13993,7 +14256,6 @@
                 <w:rFonts w:cs="BRH Malayalam Extra"/>
                 <w:szCs w:val="40"/>
               </w:rPr>
-              <w:lastRenderedPageBreak/>
               <w:t>3</w:t>
             </w:r>
             <w:r>
@@ -14386,7 +14648,6 @@
                 <w:sz w:val="32"/>
                 <w:szCs w:val="40"/>
               </w:rPr>
-              <w:lastRenderedPageBreak/>
               <w:t>qy</w:t>
             </w:r>
             <w:r>
@@ -14434,7 +14695,6 @@
                 <w:rFonts w:cs="BRH Malayalam Extra"/>
                 <w:szCs w:val="40"/>
               </w:rPr>
-              <w:lastRenderedPageBreak/>
               <w:t>16</w:t>
             </w:r>
             <w:r>
@@ -16170,6 +16430,7 @@
                 <w:szCs w:val="40"/>
                 <w:lang w:val="it-IT"/>
               </w:rPr>
+              <w:lastRenderedPageBreak/>
               <w:t>13</w:t>
             </w:r>
             <w:r>
@@ -16848,7 +17109,6 @@
                 <w:szCs w:val="40"/>
                 <w:lang w:val="it-IT"/>
               </w:rPr>
-              <w:lastRenderedPageBreak/>
               <w:t>14</w:t>
             </w:r>
             <w:r>
@@ -17833,18 +18093,8 @@
                 <w:sz w:val="32"/>
                 <w:szCs w:val="40"/>
               </w:rPr>
-              <w:t>)- A²</w:t>
-            </w:r>
-            <w:proofErr w:type="gramStart"/>
-            <w:r>
-              <w:rPr>
-                <w:rFonts w:ascii="BRH Malayalam Extra" w:hAnsi="BRH Malayalam Extra" w:cs="BRH Malayalam Extra"/>
-                <w:sz w:val="32"/>
-                <w:szCs w:val="40"/>
-              </w:rPr>
-              <w:t>x(</w:t>
-            </w:r>
-            <w:proofErr w:type="gramEnd"/>
+              <w:t>)- A²x(</w:t>
+            </w:r>
             <w:r>
               <w:rPr>
                 <w:rFonts w:cs="BRH Malayalam Extra"/>
@@ -17885,7 +18135,6 @@
               </w:rPr>
               <w:t>–</w:t>
             </w:r>
-            <w:proofErr w:type="gramStart"/>
             <w:r>
               <w:rPr>
                 <w:rFonts w:ascii="BRH Malayalam Extra" w:hAnsi="BRH Malayalam Extra" w:cs="BRH Malayalam Extra"/>
@@ -17894,7 +18143,6 @@
               </w:rPr>
               <w:t>px(</w:t>
             </w:r>
-            <w:proofErr w:type="gramEnd"/>
             <w:r>
               <w:rPr>
                 <w:rFonts w:cs="BRH Malayalam Extra"/>
@@ -17946,18 +18194,8 @@
                 <w:sz w:val="32"/>
                 <w:szCs w:val="40"/>
               </w:rPr>
-              <w:t>A²</w:t>
-            </w:r>
-            <w:proofErr w:type="gramStart"/>
-            <w:r>
-              <w:rPr>
-                <w:rFonts w:ascii="BRH Malayalam Extra" w:hAnsi="BRH Malayalam Extra" w:cs="BRH Malayalam Extra"/>
-                <w:sz w:val="32"/>
-                <w:szCs w:val="40"/>
-              </w:rPr>
-              <w:t>x(</w:t>
-            </w:r>
-            <w:proofErr w:type="gramEnd"/>
+              <w:t>A²x(</w:t>
+            </w:r>
             <w:r>
               <w:rPr>
                 <w:rFonts w:cs="BRH Malayalam Extra"/>
@@ -17998,7 +18236,6 @@
               </w:rPr>
               <w:t>–</w:t>
             </w:r>
-            <w:proofErr w:type="gramStart"/>
             <w:r>
               <w:rPr>
                 <w:rFonts w:ascii="BRH Malayalam Extra" w:hAnsi="BRH Malayalam Extra" w:cs="BRH Malayalam Extra"/>
@@ -18007,7 +18244,6 @@
               </w:rPr>
               <w:t>px(</w:t>
             </w:r>
-            <w:proofErr w:type="gramEnd"/>
             <w:r>
               <w:rPr>
                 <w:rFonts w:cs="BRH Malayalam Extra"/>
@@ -18048,7 +18284,6 @@
               </w:rPr>
               <w:t>–</w:t>
             </w:r>
-            <w:proofErr w:type="gramStart"/>
             <w:r>
               <w:rPr>
                 <w:rFonts w:ascii="BRH Malayalam Extra" w:hAnsi="BRH Malayalam Extra" w:cs="BRH Malayalam Extra"/>
@@ -18057,7 +18292,6 @@
               </w:rPr>
               <w:t>px(</w:t>
             </w:r>
-            <w:proofErr w:type="gramEnd"/>
             <w:r>
               <w:rPr>
                 <w:rFonts w:cs="BRH Malayalam Extra"/>
@@ -18071,18 +18305,8 @@
                 <w:sz w:val="32"/>
                 <w:szCs w:val="40"/>
               </w:rPr>
-              <w:t>) A²</w:t>
-            </w:r>
-            <w:proofErr w:type="gramStart"/>
-            <w:r>
-              <w:rPr>
-                <w:rFonts w:ascii="BRH Malayalam Extra" w:hAnsi="BRH Malayalam Extra" w:cs="BRH Malayalam Extra"/>
-                <w:sz w:val="32"/>
-                <w:szCs w:val="40"/>
-              </w:rPr>
-              <w:t>x(</w:t>
-            </w:r>
-            <w:proofErr w:type="gramEnd"/>
+              <w:t>) A²x(</w:t>
+            </w:r>
             <w:r>
               <w:rPr>
                 <w:rFonts w:cs="BRH Malayalam Extra"/>
@@ -18096,18 +18320,8 @@
                 <w:sz w:val="32"/>
                 <w:szCs w:val="40"/>
               </w:rPr>
-              <w:t>) A²</w:t>
-            </w:r>
-            <w:proofErr w:type="gramStart"/>
-            <w:r>
-              <w:rPr>
-                <w:rFonts w:ascii="BRH Malayalam Extra" w:hAnsi="BRH Malayalam Extra" w:cs="BRH Malayalam Extra"/>
-                <w:sz w:val="32"/>
-                <w:szCs w:val="40"/>
-              </w:rPr>
-              <w:t>x(</w:t>
-            </w:r>
-            <w:proofErr w:type="gramEnd"/>
+              <w:t>) A²x(</w:t>
+            </w:r>
             <w:r>
               <w:rPr>
                 <w:rFonts w:cs="BRH Malayalam Extra"/>
@@ -18148,7 +18362,6 @@
               </w:rPr>
               <w:t>–</w:t>
             </w:r>
-            <w:proofErr w:type="gramStart"/>
             <w:r>
               <w:rPr>
                 <w:rFonts w:ascii="BRH Malayalam Extra" w:hAnsi="BRH Malayalam Extra" w:cs="BRH Malayalam Extra"/>
@@ -18157,7 +18370,6 @@
               </w:rPr>
               <w:t>px(</w:t>
             </w:r>
-            <w:proofErr w:type="gramEnd"/>
             <w:r>
               <w:rPr>
                 <w:rFonts w:cs="BRH Malayalam Extra"/>
@@ -18230,7 +18442,6 @@
               </w:rPr>
               <w:t>–</w:t>
             </w:r>
-            <w:proofErr w:type="gramStart"/>
             <w:r>
               <w:rPr>
                 <w:rFonts w:ascii="BRH Malayalam Extra" w:hAnsi="BRH Malayalam Extra" w:cs="BRH Malayalam Extra"/>
@@ -18239,7 +18450,6 @@
               </w:rPr>
               <w:t>px(</w:t>
             </w:r>
-            <w:proofErr w:type="gramEnd"/>
             <w:r>
               <w:rPr>
                 <w:rFonts w:cs="BRH Malayalam Extra"/>
@@ -18253,18 +18463,8 @@
                 <w:sz w:val="32"/>
                 <w:szCs w:val="40"/>
               </w:rPr>
-              <w:t>) A²</w:t>
-            </w:r>
-            <w:proofErr w:type="gramStart"/>
-            <w:r>
-              <w:rPr>
-                <w:rFonts w:ascii="BRH Malayalam Extra" w:hAnsi="BRH Malayalam Extra" w:cs="BRH Malayalam Extra"/>
-                <w:sz w:val="32"/>
-                <w:szCs w:val="40"/>
-              </w:rPr>
-              <w:t>x(</w:t>
-            </w:r>
-            <w:proofErr w:type="gramEnd"/>
+              <w:t>) A²x(</w:t>
+            </w:r>
             <w:r>
               <w:rPr>
                 <w:rFonts w:cs="BRH Malayalam Extra"/>
@@ -18278,18 +18478,8 @@
                 <w:sz w:val="32"/>
                 <w:szCs w:val="40"/>
               </w:rPr>
-              <w:t>) A²</w:t>
-            </w:r>
-            <w:proofErr w:type="gramStart"/>
-            <w:r>
-              <w:rPr>
-                <w:rFonts w:ascii="BRH Malayalam Extra" w:hAnsi="BRH Malayalam Extra" w:cs="BRH Malayalam Extra"/>
-                <w:sz w:val="32"/>
-                <w:szCs w:val="40"/>
-              </w:rPr>
-              <w:t>x(</w:t>
-            </w:r>
-            <w:proofErr w:type="gramEnd"/>
+              <w:t>) A²x(</w:t>
+            </w:r>
             <w:r>
               <w:rPr>
                 <w:rFonts w:cs="BRH Malayalam Extra"/>
@@ -18330,7 +18520,6 @@
               </w:rPr>
               <w:t>–</w:t>
             </w:r>
-            <w:proofErr w:type="gramStart"/>
             <w:r>
               <w:rPr>
                 <w:rFonts w:ascii="BRH Malayalam Extra" w:hAnsi="BRH Malayalam Extra" w:cs="BRH Malayalam Extra"/>
@@ -18339,7 +18528,6 @@
               </w:rPr>
               <w:t>px(</w:t>
             </w:r>
-            <w:proofErr w:type="gramEnd"/>
             <w:r>
               <w:rPr>
                 <w:rFonts w:cs="BRH Malayalam Extra"/>
@@ -18390,6 +18578,7 @@
                 <w:rFonts w:cs="BRH Malayalam Extra"/>
                 <w:szCs w:val="40"/>
               </w:rPr>
+              <w:lastRenderedPageBreak/>
               <w:t>13</w:t>
             </w:r>
             <w:r>
@@ -18500,7 +18689,6 @@
               </w:rPr>
               <w:t>–</w:t>
             </w:r>
-            <w:proofErr w:type="gramStart"/>
             <w:r>
               <w:rPr>
                 <w:rFonts w:ascii="BRH Malayalam Extra" w:hAnsi="BRH Malayalam Extra" w:cs="BRH Malayalam Extra"/>
@@ -18509,7 +18697,6 @@
               </w:rPr>
               <w:t>px(</w:t>
             </w:r>
-            <w:proofErr w:type="gramEnd"/>
             <w:r>
               <w:rPr>
                 <w:rFonts w:cs="BRH Malayalam Extra"/>
@@ -18596,7 +18783,6 @@
               </w:rPr>
               <w:t>–</w:t>
             </w:r>
-            <w:proofErr w:type="gramStart"/>
             <w:r>
               <w:rPr>
                 <w:rFonts w:ascii="BRH Malayalam Extra" w:hAnsi="BRH Malayalam Extra" w:cs="BRH Malayalam Extra"/>
@@ -18605,7 +18791,6 @@
               </w:rPr>
               <w:t>px(</w:t>
             </w:r>
-            <w:proofErr w:type="gramEnd"/>
             <w:r>
               <w:rPr>
                 <w:rFonts w:cs="BRH Malayalam Extra"/>
@@ -18678,7 +18863,6 @@
               </w:rPr>
               <w:t>–</w:t>
             </w:r>
-            <w:proofErr w:type="gramStart"/>
             <w:r>
               <w:rPr>
                 <w:rFonts w:ascii="BRH Malayalam Extra" w:hAnsi="BRH Malayalam Extra" w:cs="BRH Malayalam Extra"/>
@@ -18687,7 +18871,6 @@
               </w:rPr>
               <w:t>px(</w:t>
             </w:r>
-            <w:proofErr w:type="gramEnd"/>
             <w:r>
               <w:rPr>
                 <w:rFonts w:cs="BRH Malayalam Extra"/>
@@ -18728,7 +18911,6 @@
               </w:rPr>
               <w:t>–</w:t>
             </w:r>
-            <w:proofErr w:type="gramStart"/>
             <w:r>
               <w:rPr>
                 <w:rFonts w:ascii="BRH Malayalam Extra" w:hAnsi="BRH Malayalam Extra" w:cs="BRH Malayalam Extra"/>
@@ -18737,7 +18919,6 @@
               </w:rPr>
               <w:t>px(</w:t>
             </w:r>
-            <w:proofErr w:type="gramEnd"/>
             <w:r>
               <w:rPr>
                 <w:rFonts w:cs="BRH Malayalam Extra"/>
@@ -18864,7 +19045,6 @@
               </w:rPr>
               <w:t>–</w:t>
             </w:r>
-            <w:proofErr w:type="gramStart"/>
             <w:r>
               <w:rPr>
                 <w:rFonts w:ascii="BRH Malayalam Extra" w:hAnsi="BRH Malayalam Extra" w:cs="BRH Malayalam Extra"/>
@@ -18873,7 +19053,6 @@
               </w:rPr>
               <w:t>px(</w:t>
             </w:r>
-            <w:proofErr w:type="gramEnd"/>
             <w:r>
               <w:rPr>
                 <w:rFonts w:cs="BRH Malayalam Extra"/>
@@ -18914,7 +19093,6 @@
               </w:rPr>
               <w:t>–</w:t>
             </w:r>
-            <w:proofErr w:type="gramStart"/>
             <w:r>
               <w:rPr>
                 <w:rFonts w:ascii="BRH Malayalam Extra" w:hAnsi="BRH Malayalam Extra" w:cs="BRH Malayalam Extra"/>
@@ -18923,7 +19101,6 @@
               </w:rPr>
               <w:t>px(</w:t>
             </w:r>
-            <w:proofErr w:type="gramEnd"/>
             <w:r>
               <w:rPr>
                 <w:rFonts w:cs="BRH Malayalam Extra"/>
@@ -18990,7 +19167,6 @@
                 <w:rFonts w:cs="BRH Malayalam Extra"/>
                 <w:szCs w:val="40"/>
               </w:rPr>
-              <w:lastRenderedPageBreak/>
               <w:t>14</w:t>
             </w:r>
             <w:r>
@@ -19101,7 +19277,6 @@
               </w:rPr>
               <w:t>–</w:t>
             </w:r>
-            <w:proofErr w:type="gramStart"/>
             <w:r>
               <w:rPr>
                 <w:rFonts w:ascii="BRH Malayalam Extra" w:hAnsi="BRH Malayalam Extra" w:cs="BRH Malayalam Extra"/>
@@ -19110,7 +19285,6 @@
               </w:rPr>
               <w:t>px(</w:t>
             </w:r>
-            <w:proofErr w:type="gramEnd"/>
             <w:r>
               <w:rPr>
                 <w:rFonts w:cs="BRH Malayalam Extra"/>
@@ -19156,7 +19330,6 @@
               </w:rPr>
               <w:t>–</w:t>
             </w:r>
-            <w:proofErr w:type="gramStart"/>
             <w:r>
               <w:rPr>
                 <w:rFonts w:ascii="BRH Malayalam Extra" w:hAnsi="BRH Malayalam Extra" w:cs="BRH Malayalam Extra"/>
@@ -19165,7 +19338,6 @@
               </w:rPr>
               <w:t>px(</w:t>
             </w:r>
-            <w:proofErr w:type="gramEnd"/>
             <w:r>
               <w:rPr>
                 <w:rFonts w:cs="BRH Malayalam Extra"/>
@@ -19195,18 +19367,8 @@
                 <w:sz w:val="32"/>
                 <w:szCs w:val="40"/>
               </w:rPr>
-              <w:t xml:space="preserve"> eÙz˜ - </w:t>
-            </w:r>
-            <w:proofErr w:type="gramStart"/>
-            <w:r>
-              <w:rPr>
-                <w:rFonts w:ascii="BRH Malayalam Extra" w:hAnsi="BRH Malayalam Extra" w:cs="BRH Malayalam Extra"/>
-                <w:sz w:val="32"/>
-                <w:szCs w:val="40"/>
-              </w:rPr>
-              <w:t>px(</w:t>
-            </w:r>
-            <w:proofErr w:type="gramEnd"/>
+              <w:t xml:space="preserve"> eÙz˜ - px(</w:t>
+            </w:r>
             <w:r>
               <w:rPr>
                 <w:rFonts w:cs="BRH Malayalam Extra"/>
@@ -21038,6 +21200,7 @@
                 <w:szCs w:val="40"/>
                 <w:lang w:val="it-IT"/>
               </w:rPr>
+              <w:lastRenderedPageBreak/>
               <w:t>8</w:t>
             </w:r>
             <w:r>
@@ -22046,7 +22209,6 @@
                 <w:rFonts w:cs="BRH Malayalam Extra"/>
                 <w:szCs w:val="40"/>
               </w:rPr>
-              <w:lastRenderedPageBreak/>
               <w:t>1</w:t>
             </w:r>
             <w:r>
@@ -24053,6 +24215,7 @@
                 <w:szCs w:val="40"/>
                 <w:lang w:val="it-IT"/>
               </w:rPr>
+              <w:lastRenderedPageBreak/>
               <w:t>A¥dû—</w:t>
             </w:r>
             <w:r>
@@ -24416,6 +24579,7 @@
                 <w:szCs w:val="40"/>
                 <w:lang w:val="it-IT"/>
               </w:rPr>
+              <w:lastRenderedPageBreak/>
               <w:t>6</w:t>
             </w:r>
             <w:r>
@@ -25583,6 +25747,7 @@
                 <w:szCs w:val="40"/>
                 <w:lang w:val="it-IT"/>
               </w:rPr>
+              <w:lastRenderedPageBreak/>
               <w:t>A¥dû—</w:t>
             </w:r>
             <w:r>

</xml_diff>

<commit_message>
nmv 30 05 2026
</commit_message>
<xml_diff>
--- a/TS Jatai Ghanam Project/TS 1.4/TS 1.4 Ghanam Malayalam Corrections.docx
+++ b/TS Jatai Ghanam Project/TS 1.4/TS 1.4 Ghanam Malayalam Corrections.docx
@@ -30,10 +30,9 @@
           <w:bCs/>
           <w:sz w:val="32"/>
           <w:szCs w:val="32"/>
-          <w:highlight w:val="red"/>
           <w:u w:val="single"/>
         </w:rPr>
-        <w:t>?????</w:t>
+        <w:t>30th June 2926</w:t>
       </w:r>
     </w:p>
     <w:p>
@@ -1457,6 +1456,16 @@
           <w:u w:val="single"/>
         </w:rPr>
       </w:pPr>
+      <w:r>
+        <w:rPr>
+          <w:b/>
+          <w:bCs/>
+          <w:sz w:val="32"/>
+          <w:szCs w:val="32"/>
+          <w:u w:val="single"/>
+        </w:rPr>
+        <w:t>==============</w:t>
+      </w:r>
     </w:p>
     <w:p>
       <w:pPr>

</xml_diff>